<commit_message>
feat: expire unpaid online stock reservations
</commit_message>
<xml_diff>
--- a/docs/Jaunpur_Footwear_Deployment_Setup.docx
+++ b/docs/Jaunpur_Footwear_Deployment_Setup.docx
@@ -31,7 +31,7 @@
         <w:pStyle w:val="Normal"/>
       </w:pPr>
       <w:r>
-        <w:t xml:space="preserve">Prepared 7 October 2026 · Repository review · Branch: sartaj</w:t>
+        <w:t xml:space="preserve">Prepared 8 October 2026 · Repository review · Branch: sartaj</w:t>
       </w:r>
     </w:p>
     <w:p>
@@ -784,7 +784,7 @@
               <w:pStyle w:val="TableText"/>
             </w:pPr>
             <w:r>
-              <w:t xml:space="preserve">Redis broker URL.</w:t>
+              <w:t xml:space="preserve">Redis broker URL. Celery Beat also expires unpaid online-payment reservations; the timeout defaults to 15 minutes and can be changed with ORDER_STOCK_RESERVATION_MINUTES.</w:t>
             </w:r>
           </w:p>
         </w:tc>

</xml_diff>